<commit_message>
feat: add cover image to paper template header
</commit_message>
<xml_diff>
--- a/public/JEW-论文模板.docx
+++ b/public/JEW-论文模板.docx
@@ -2,94 +2,223 @@
 <file path=word/document.xml><?xml version="1.0" encoding="utf-8"?>
 <w:document xmlns:wpc="http://schemas.microsoft.com/office/word/2010/wordprocessingCanvas" xmlns:mc="http://schemas.openxmlformats.org/markup-compatibility/2006" xmlns:o="urn:schemas-microsoft-com:office:office" xmlns:r="http://schemas.openxmlformats.org/officeDocument/2006/relationships" xmlns:m="http://schemas.openxmlformats.org/officeDocument/2006/math" xmlns:v="urn:schemas-microsoft-com:vml" xmlns:wp14="http://schemas.microsoft.com/office/word/2010/wordprocessingDrawing" xmlns:wp="http://schemas.openxmlformats.org/drawingml/2006/wordprocessingDrawing" xmlns:w10="urn:schemas-microsoft-com:office:word" xmlns:w="http://schemas.openxmlformats.org/wordprocessingml/2006/main" xmlns:w14="http://schemas.microsoft.com/office/word/2010/wordml" xmlns:w15="http://schemas.microsoft.com/office/word/2012/wordml" xmlns:wpg="http://schemas.microsoft.com/office/word/2010/wordprocessingGroup" xmlns:wpi="http://schemas.microsoft.com/office/word/2010/wordprocessingInk" xmlns:wne="http://schemas.microsoft.com/office/word/2006/wordml" xmlns:wps="http://schemas.microsoft.com/office/word/2010/wordprocessingShape" xmlns:cx="http://schemas.microsoft.com/office/drawing/2014/chartex" xmlns:cx1="http://schemas.microsoft.com/office/drawing/2015/9/8/chartex" xmlns:cx2="http://schemas.microsoft.com/office/drawing/2015/10/21/chartex" xmlns:cx3="http://schemas.microsoft.com/office/drawing/2016/5/9/chartex" xmlns:cx4="http://schemas.microsoft.com/office/drawing/2016/5/10/chartex" xmlns:cx5="http://schemas.microsoft.com/office/drawing/2016/5/11/chartex" xmlns:cx6="http://schemas.microsoft.com/office/drawing/2016/5/12/chartex" xmlns:cx7="http://schemas.microsoft.com/office/drawing/2016/5/13/chartex" xmlns:cx8="http://schemas.microsoft.com/office/drawing/2016/5/14/chartex" xmlns:aink="http://schemas.microsoft.com/office/drawing/2016/ink" xmlns:am3d="http://schemas.microsoft.com/office/drawing/2017/model3d" xmlns:w16cex="http://schemas.microsoft.com/office/word/2018/wordml/cex" xmlns:w16cid="http://schemas.microsoft.com/office/word/2016/wordml/cid" xmlns:w16="http://schemas.microsoft.com/office/word/2018/wordml" xmlns:w16sdtdh="http://schemas.microsoft.com/office/word/2020/wordml/sdtdatahash" xmlns:w16se="http://schemas.microsoft.com/office/word/2015/wordml/symex" mc:Ignorable="w14 w15 wp14">
   <w:body>
-    <w:p>
-      <w:pPr>
-        <w:spacing w:after="100"/>
-        <w:jc w:val="left"/>
-      </w:pPr>
-      <w:r>
-        <w:rPr>
-          <w:rFonts w:ascii="Arial" w:eastAsia="SimHei" w:hAnsi="Arial"/>
-          <w:b/>
-          <w:bCs/>
-          <w:color w:val="003366"/>
-          <w:sz w:val="32"/>
-          <w:szCs w:val="32"/>
-        </w:rPr>
-        <w:t xml:space="preserve">JEW</w:t>
-      </w:r>
-      <w:r>
-        <w:rPr>
-          <w:rFonts w:ascii="Times New Roman" w:eastAsia="SimHei" w:hAnsi="Times New Roman"/>
-          <w:b/>
-          <w:bCs/>
-          <w:i w:val="false"/>
-          <w:iCs w:val="false"/>
-          <w:color w:val="000000"/>
-          <w:sz w:val="24"/>
-          <w:szCs w:val="24"/>
-        </w:rPr>
-        <w:t xml:space="preserve">  极端天气学报</w:t>
-      </w:r>
-      <w:r>
-        <w:rPr>
-          <w:rFonts w:ascii="Times New Roman" w:eastAsia="SimSun" w:hAnsi="Times New Roman"/>
-          <w:b/>
-          <w:bCs/>
-          <w:i w:val="false"/>
-          <w:iCs w:val="false"/>
-          <w:color w:val="000000"/>
-          <w:sz w:val="20"/>
-          <w:szCs w:val="20"/>
-        </w:rPr>
-        <w:t xml:space="preserve">  Journal of Extreme Weather</w:t>
-      </w:r>
-    </w:p>
-    <w:p>
-      <w:pPr>
-        <w:spacing w:after="60"/>
-        <w:jc w:val="right"/>
-      </w:pPr>
-      <w:r>
-        <w:rPr>
-          <w:rFonts w:ascii="Times New Roman" w:eastAsia="SimSun" w:hAnsi="Times New Roman"/>
-          <w:b w:val="false"/>
-          <w:bCs w:val="false"/>
-          <w:i w:val="false"/>
-          <w:iCs w:val="false"/>
-          <w:color w:val="666666"/>
-          <w:sz w:val="18"/>
-          <w:szCs w:val="18"/>
-        </w:rPr>
-        <w:t xml:space="preserve">ISSN: 6666-6666</w:t>
-      </w:r>
-    </w:p>
+    <w:tbl>
+      <w:tblPr>
+        <w:tblW w:type="pct" w:w="100%"/>
+        <w:tblBorders>
+          <w:top w:val="single" w:color="auto" w:sz="4"/>
+          <w:left w:val="single" w:color="auto" w:sz="4"/>
+          <w:bottom w:val="single" w:color="auto" w:sz="4"/>
+          <w:right w:val="single" w:color="auto" w:sz="4"/>
+          <w:insideH w:val="single" w:color="auto" w:sz="4"/>
+          <w:insideV w:val="single" w:color="auto" w:sz="4"/>
+        </w:tblBorders>
+      </w:tblPr>
+      <w:tblGrid>
+        <w:gridCol w:w="2400"/>
+        <w:gridCol w:w="6600"/>
+      </w:tblGrid>
+      <w:tr>
+        <w:trPr>
+          <w:cantSplit/>
+        </w:trPr>
+        <w:tc>
+          <w:tcPr>
+            <w:tcW w:type="dxa" w:w="2400"/>
+            <w:tcBorders>
+              <w:top w:val="none" w:color="FFFFFF" w:sz="0"/>
+              <w:left w:val="none" w:color="FFFFFF" w:sz="0"/>
+              <w:bottom w:val="none" w:color="FFFFFF" w:sz="0"/>
+              <w:right w:val="none" w:color="FFFFFF" w:sz="0"/>
+            </w:tcBorders>
+            <w:tcMar>
+              <w:top w:type="dxa" w:w="0"/>
+              <w:left w:type="dxa" w:w="0"/>
+              <w:bottom w:type="dxa" w:w="0"/>
+              <w:right w:type="dxa" w:w="200"/>
+            </w:tcMar>
+            <w:vAlign w:val="center"/>
+          </w:tcPr>
+          <w:p>
+            <w:pPr>
+              <w:spacing w:after="0"/>
+              <w:jc w:val="left"/>
+            </w:pPr>
+            <w:r>
+              <w:drawing>
+                <wp:inline distT="0" distB="0" distL="0" distR="0">
+                  <wp:extent cx="1143000" cy="1524000"/>
+                  <wp:effectExtent t="0" r="0" b="0" l="0"/>
+                  <wp:docPr id="1" name="cover" descr="Journal of Extreme Weather Cover" title="JEW Cover"/>
+                  <wp:cNvGraphicFramePr>
+                    <a:graphicFrameLocks xmlns:a="http://schemas.openxmlformats.org/drawingml/2006/main" noChangeAspect="1"/>
+                  </wp:cNvGraphicFramePr>
+                  <a:graphic xmlns:a="http://schemas.openxmlformats.org/drawingml/2006/main">
+                    <a:graphicData uri="http://schemas.openxmlformats.org/drawingml/2006/picture">
+                      <pic:pic xmlns:pic="http://schemas.openxmlformats.org/drawingml/2006/picture">
+                        <pic:nvPicPr>
+                          <pic:cNvPr id="0" name="" descr=""/>
+                          <pic:cNvPicPr>
+                            <a:picLocks noChangeAspect="1" noChangeArrowheads="1"/>
+                          </pic:cNvPicPr>
+                        </pic:nvPicPr>
+                        <pic:blipFill>
+                          <a:blip r:embed="rId9" cstate="none"/>
+                          <a:srcRect/>
+                          <a:stretch>
+                            <a:fillRect/>
+                          </a:stretch>
+                        </pic:blipFill>
+                        <pic:spPr bwMode="auto">
+                          <a:xfrm>
+                            <a:off x="0" y="0"/>
+                            <a:ext cx="1143000" cy="1524000"/>
+                          </a:xfrm>
+                          <a:prstGeom prst="rect">
+                            <a:avLst/>
+                          </a:prstGeom>
+                        </pic:spPr>
+                      </pic:pic>
+                    </a:graphicData>
+                  </a:graphic>
+                </wp:inline>
+              </w:drawing>
+            </w:r>
+          </w:p>
+        </w:tc>
+        <w:tc>
+          <w:tcPr>
+            <w:tcW w:type="dxa" w:w="6600"/>
+            <w:tcBorders>
+              <w:top w:val="none" w:color="FFFFFF" w:sz="0"/>
+              <w:left w:val="none" w:color="FFFFFF" w:sz="0"/>
+              <w:bottom w:val="none" w:color="FFFFFF" w:sz="0"/>
+              <w:right w:val="none" w:color="FFFFFF" w:sz="0"/>
+            </w:tcBorders>
+            <w:tcMar>
+              <w:top w:type="dxa" w:w="0"/>
+              <w:left w:type="dxa" w:w="200"/>
+              <w:bottom w:type="dxa" w:w="0"/>
+              <w:right w:type="dxa" w:w="0"/>
+            </w:tcMar>
+            <w:vAlign w:val="center"/>
+          </w:tcPr>
+          <w:p>
+            <w:pPr>
+              <w:spacing w:after="100"/>
+              <w:jc w:val="left"/>
+            </w:pPr>
+            <w:r>
+              <w:rPr>
+                <w:rFonts w:ascii="Arial" w:eastAsia="SimHei" w:hAnsi="Arial"/>
+                <w:b/>
+                <w:bCs/>
+                <w:color w:val="003366"/>
+                <w:sz w:val="32"/>
+                <w:szCs w:val="32"/>
+              </w:rPr>
+              <w:t xml:space="preserve">JEW</w:t>
+            </w:r>
+            <w:r>
+              <w:rPr>
+                <w:rFonts w:ascii="Times New Roman" w:eastAsia="SimHei" w:hAnsi="Times New Roman"/>
+                <w:b/>
+                <w:bCs/>
+                <w:i w:val="false"/>
+                <w:iCs w:val="false"/>
+                <w:color w:val="000000"/>
+                <w:sz w:val="24"/>
+                <w:szCs w:val="24"/>
+              </w:rPr>
+              <w:t xml:space="preserve">  极端天气学报</w:t>
+            </w:r>
+          </w:p>
+          <w:p>
+            <w:pPr>
+              <w:spacing w:after="80"/>
+              <w:jc w:val="left"/>
+            </w:pPr>
+            <w:r>
+              <w:rPr>
+                <w:rFonts w:ascii="Times New Roman" w:eastAsia="SimSun" w:hAnsi="Times New Roman"/>
+                <w:b/>
+                <w:bCs/>
+                <w:i w:val="false"/>
+                <w:iCs w:val="false"/>
+                <w:color w:val="000000"/>
+                <w:sz w:val="20"/>
+                <w:szCs w:val="20"/>
+              </w:rPr>
+              <w:t xml:space="preserve">Journal of Extreme Weather</w:t>
+            </w:r>
+          </w:p>
+          <w:p>
+            <w:pPr>
+              <w:spacing w:after="60"/>
+              <w:jc w:val="left"/>
+            </w:pPr>
+            <w:r>
+              <w:rPr>
+                <w:rFonts w:ascii="Times New Roman" w:eastAsia="SimSun" w:hAnsi="Times New Roman"/>
+                <w:b w:val="false"/>
+                <w:bCs w:val="false"/>
+                <w:i w:val="false"/>
+                <w:iCs w:val="false"/>
+                <w:color w:val="666666"/>
+                <w:sz w:val="18"/>
+                <w:szCs w:val="18"/>
+              </w:rPr>
+              <w:t xml:space="preserve">ISSN: 6666-6666  |  Impact Factor: 66.6</w:t>
+            </w:r>
+          </w:p>
+          <w:p>
+            <w:pPr>
+              <w:spacing w:after="60"/>
+              <w:jc w:val="left"/>
+            </w:pPr>
+            <w:r>
+              <w:rPr>
+                <w:rFonts w:ascii="Times New Roman" w:eastAsia="SimSun" w:hAnsi="Times New Roman"/>
+                <w:b w:val="false"/>
+                <w:bCs w:val="false"/>
+                <w:i w:val="false"/>
+                <w:iCs w:val="false"/>
+                <w:color w:val="666666"/>
+                <w:sz w:val="18"/>
+                <w:szCs w:val="18"/>
+              </w:rPr>
+              <w:t xml:space="preserve">Vol. 12, No. 3, 2026, pp. 1--25</w:t>
+            </w:r>
+          </w:p>
+          <w:p>
+            <w:pPr>
+              <w:spacing w:after="0"/>
+              <w:jc w:val="left"/>
+            </w:pPr>
+            <w:r>
+              <w:rPr>
+                <w:rFonts w:ascii="Times New Roman" w:eastAsia="SimSun" w:hAnsi="Times New Roman"/>
+                <w:b w:val="false"/>
+                <w:bCs w:val="false"/>
+                <w:i w:val="false"/>
+                <w:iCs w:val="false"/>
+                <w:color w:val="666666"/>
+                <w:sz w:val="18"/>
+                <w:szCs w:val="18"/>
+              </w:rPr>
+              <w:t xml:space="preserve">Publisher: 十三期极端天气研究所</w:t>
+            </w:r>
+          </w:p>
+        </w:tc>
+      </w:tr>
+    </w:tbl>
     <w:p>
       <w:pPr>
         <w:pBdr>
           <w:bottom w:val="single" w:color="003366" w:sz="6"/>
         </w:pBdr>
-        <w:spacing w:after="60"/>
-      </w:pPr>
-    </w:p>
-    <w:p>
-      <w:pPr>
-        <w:spacing w:after="200"/>
-        <w:jc w:val="center"/>
-      </w:pPr>
-      <w:r>
-        <w:rPr>
-          <w:rFonts w:ascii="Times New Roman" w:eastAsia="SimSun" w:hAnsi="Times New Roman"/>
-          <w:b w:val="false"/>
-          <w:bCs w:val="false"/>
-          <w:i w:val="false"/>
-          <w:iCs w:val="false"/>
-          <w:color w:val="666666"/>
-          <w:sz w:val="18"/>
-          <w:szCs w:val="18"/>
-        </w:rPr>
-        <w:t xml:space="preserve">Vol. 12, No. 3, 2026, pp. 1--25</w:t>
-      </w:r>
+        <w:spacing w:after="200" w:before="120"/>
+      </w:pPr>
     </w:p>
     <w:p>
       <w:pPr>

</xml_diff>

<commit_message>
feat: add sample paper (Typhoon Mujigae) in JEW template
</commit_message>
<xml_diff>
--- a/public/JEW-论文模板.docx
+++ b/public/JEW-论文模板.docx
@@ -2344,7 +2344,7 @@
       </w:r>
     </w:p>
     <w:sectPr>
-      <w:headerReference w:type="default" r:id="rId7"/>
+      <w:headerReference w:type="default" r:id="rId11"/>
       <w:footerReference w:type="default" r:id="rId8"/>
       <w:pgSz w:w="11906" w:h="16838" w:orient="portrait"/>
       <w:pgMar w:top="1440" w:right="1797" w:bottom="1440" w:left="1797" w:header="708" w:footer="708" w:gutter="0"/>
@@ -2493,6 +2493,87 @@
         <w:szCs w:val="16"/>
       </w:rPr>
       <w:t xml:space="preserve">JEW  极端天气学报  Journal of Extreme Weather</w:t>
+    </w:r>
+  </w:p>
+</w:hdr>
+</file>
+
+<file path=word/header_watermark.xml><?xml version="1.0" encoding="utf-8"?>
+<w:hdr xmlns:w="http://schemas.openxmlformats.org/wordprocessingml/2006/main" xmlns:r="http://schemas.openxmlformats.org/officeDocument/2006/relationships" xmlns:wp="http://schemas.openxmlformats.org/drawingml/2006/wordprocessingDrawing" xmlns:a="http://schemas.openxmlformats.org/drawingml/2006/main" xmlns:wps="http://schemas.microsoft.com/office/word/2010/wordprocessingShape" xmlns:mc="http://schemas.openxmlformats.org/markup-compatibility/2006" xmlns:wp14="http://schemas.microsoft.com/office/word/2010/wordprocessingDrawing" xmlns:w14="http://schemas.microsoft.com/office/word/2010/wordml" mc:Ignorable="w14 wp14">
+  <w:p>
+    <w:pPr>
+      <w:pStyle w:val="Header"/>
+    </w:pPr>
+    <w:r>
+      <w:rPr>
+        <w:noProof/>
+      </w:rPr>
+      <mc:AlternateContent>
+        <mc:Choice Requires="wps">
+          <w:drawing>
+            <wp:anchor distT="0" distB="0" distL="0" distR="0" simplePos="0" relativeHeight="251658240" behindDoc="1" locked="0" layoutInCell="0" allowOverlap="1">
+              <wp:simplePos x="0" y="0"/>
+              <wp:positionH relativeFrom="page">
+                <wp:align>right</wp:align>
+              </wp:positionH>
+              <wp:positionV relativeFrom="page">
+                <wp:align>bottom</wp:align>
+              </wp:positionV>
+              <wp:extent cx="2200000" cy="350000"/>
+              <wp:effectExtent l="0" t="0" r="0" b="0"/>
+              <wp:wrapNone/>
+              <wp:docPr id="2" name="Watermark"/>
+              <a:graphic>
+                <a:graphicData uri="http://schemas.microsoft.com/office/word/2010/wordprocessingShape">
+                  <wps:wsp>
+                    <wps:cNvSpPr txBox="1"/>
+                    <wps:spPr>
+                      <a:xfrm rot="0">
+                        <a:off x="0" y="0"/>
+                        <a:ext cx="2200000" cy="350000"/>
+                      </a:xfrm>
+                      <a:prstGeom prst="rect">
+                        <a:avLst/>
+                      </a:prstGeom>
+                      <a:noFill/>
+                      <a:ln>
+                        <a:noFill/>
+                      </a:ln>
+                    </wps:spPr>
+                    <wps:txbx>
+                      <w:txbxContent>
+                        <w:p>
+                          <w:pPr>
+                            <w:jc w:val="right"/>
+                          </w:pPr>
+                          <w:r>
+                            <w:rPr>
+                              <w:sz w:val="32"/>
+                              <w:szCs w:val="32"/>
+                              <w:rFonts w:eastAsia="SimSun" w:ascii="Arial" w:hAnsi="Arial"/>
+                              <w:color w:val="808080"/>
+                              <w14:textFill>
+                                <w14:solidFill>
+                                  <w14:srgbClr w14:val="808080">
+                                    <w14:alpha w14:val="19999"/>
+                                  </w14:srgbClr>
+                                </w14:solidFill>
+                              </w14:textFill>
+                            </w:rPr>
+                            <w:t>TRAE AI 生成</w:t>
+                          </w:r>
+                        </w:p>
+                      </w:txbxContent>
+                    </wps:txbx>
+                    <wps:bodyPr wrap="square" anchor="b" anchorCtr="0" lIns="0" tIns="0" rIns="91440" bIns="45720"/>
+                  </wps:wsp>
+                </a:graphicData>
+              </a:graphic>
+            </wp:anchor>
+          </w:drawing>
+        </mc:Choice>
+        <mc:Fallback/>
+      </mc:AlternateContent>
     </w:r>
   </w:p>
 </w:hdr>

</xml_diff>